<commit_message>
Probando de nuevo el word
</commit_message>
<xml_diff>
--- a/CARATULA.docx
+++ b/CARATULA.docx
@@ -1,6 +1,6 @@
 
 <file path=word/document.xml><?xml version="1.0" encoding="utf-8"?>
-<w:document xmlns:wpc="http://schemas.microsoft.com/office/word/2010/wordprocessingCanvas" xmlns:cx="http://schemas.microsoft.com/office/drawing/2014/chartex" xmlns:cx1="http://schemas.microsoft.com/office/drawing/2015/9/8/chartex" xmlns:cx2="http://schemas.microsoft.com/office/drawing/2015/10/21/chartex" xmlns:cx3="http://schemas.microsoft.com/office/drawing/2016/5/9/chartex" xmlns:cx4="http://schemas.microsoft.com/office/drawing/2016/5/10/chartex" xmlns:cx5="http://schemas.microsoft.com/office/drawing/2016/5/11/chartex" xmlns:cx6="http://schemas.microsoft.com/office/drawing/2016/5/12/chartex" xmlns:cx7="http://schemas.microsoft.com/office/drawing/2016/5/13/chartex" xmlns:cx8="http://schemas.microsoft.com/office/drawing/2016/5/14/chartex" xmlns:mc="http://schemas.openxmlformats.org/markup-compatibility/2006" xmlns:aink="http://schemas.microsoft.com/office/drawing/2016/ink" xmlns:am3d="http://schemas.microsoft.com/office/drawing/2017/model3d" xmlns:o="urn:schemas-microsoft-com:office:office" xmlns:r="http://schemas.openxmlformats.org/officeDocument/2006/relationships" xmlns:m="http://schemas.openxmlformats.org/officeDocument/2006/math" xmlns:v="urn:schemas-microsoft-com:vml" xmlns:wp14="http://schemas.microsoft.com/office/word/2010/wordprocessingDrawing" xmlns:wp="http://schemas.openxmlformats.org/drawingml/2006/wordprocessingDrawing" xmlns:w10="urn:schemas-microsoft-com:office:word" xmlns:w="http://schemas.openxmlformats.org/wordprocessingml/2006/main" xmlns:w14="http://schemas.microsoft.com/office/word/2010/wordml" xmlns:w15="http://schemas.microsoft.com/office/word/2012/wordml" xmlns:w16cex="http://schemas.microsoft.com/office/word/2018/wordml/cex" xmlns:w16cid="http://schemas.microsoft.com/office/word/2016/wordml/cid" xmlns:w16="http://schemas.microsoft.com/office/word/2018/wordml" xmlns:w16sdtdh="http://schemas.microsoft.com/office/word/2020/wordml/sdtdatahash" xmlns:w16se="http://schemas.microsoft.com/office/word/2015/wordml/symex" xmlns:wpg="http://schemas.microsoft.com/office/word/2010/wordprocessingGroup" xmlns:wpi="http://schemas.microsoft.com/office/word/2010/wordprocessingInk" xmlns:wne="http://schemas.microsoft.com/office/word/2006/wordml" xmlns:wps="http://schemas.microsoft.com/office/word/2010/wordprocessingShape" mc:Ignorable="w14 w15 w16se w16cid w16 w16cex w16sdtdh wp14">
+<w:document xmlns:wpc="http://schemas.microsoft.com/office/word/2010/wordprocessingCanvas" xmlns:cx="http://schemas.microsoft.com/office/drawing/2014/chartex" xmlns:cx1="http://schemas.microsoft.com/office/drawing/2015/9/8/chartex" xmlns:cx2="http://schemas.microsoft.com/office/drawing/2015/10/21/chartex" xmlns:cx3="http://schemas.microsoft.com/office/drawing/2016/5/9/chartex" xmlns:cx4="http://schemas.microsoft.com/office/drawing/2016/5/10/chartex" xmlns:cx5="http://schemas.microsoft.com/office/drawing/2016/5/11/chartex" xmlns:cx6="http://schemas.microsoft.com/office/drawing/2016/5/12/chartex" xmlns:cx7="http://schemas.microsoft.com/office/drawing/2016/5/13/chartex" xmlns:cx8="http://schemas.microsoft.com/office/drawing/2016/5/14/chartex" xmlns:mc="http://schemas.openxmlformats.org/markup-compatibility/2006" xmlns:aink="http://schemas.microsoft.com/office/drawing/2016/ink" xmlns:am3d="http://schemas.microsoft.com/office/drawing/2017/model3d" xmlns:o="urn:schemas-microsoft-com:office:office" xmlns:oel="http://schemas.microsoft.com/office/2019/extlst" xmlns:r="http://schemas.openxmlformats.org/officeDocument/2006/relationships" xmlns:m="http://schemas.openxmlformats.org/officeDocument/2006/math" xmlns:v="urn:schemas-microsoft-com:vml" xmlns:wp14="http://schemas.microsoft.com/office/word/2010/wordprocessingDrawing" xmlns:wp="http://schemas.openxmlformats.org/drawingml/2006/wordprocessingDrawing" xmlns:w10="urn:schemas-microsoft-com:office:word" xmlns:w="http://schemas.openxmlformats.org/wordprocessingml/2006/main" xmlns:w14="http://schemas.microsoft.com/office/word/2010/wordml" xmlns:w15="http://schemas.microsoft.com/office/word/2012/wordml" xmlns:w16cex="http://schemas.microsoft.com/office/word/2018/wordml/cex" xmlns:w16cid="http://schemas.microsoft.com/office/word/2016/wordml/cid" xmlns:w16="http://schemas.microsoft.com/office/word/2018/wordml" xmlns:w16sdtdh="http://schemas.microsoft.com/office/word/2020/wordml/sdtdatahash" xmlns:w16se="http://schemas.microsoft.com/office/word/2015/wordml/symex" xmlns:wpg="http://schemas.microsoft.com/office/word/2010/wordprocessingGroup" xmlns:wpi="http://schemas.microsoft.com/office/word/2010/wordprocessingInk" xmlns:wne="http://schemas.microsoft.com/office/word/2006/wordml" xmlns:wps="http://schemas.microsoft.com/office/word/2010/wordprocessingShape" mc:Ignorable="w14 w15 w16se w16cid w16 w16cex w16sdtdh wp14">
   <w:body>
     <w:p>
       <w:pPr>
@@ -268,18 +268,159 @@
           <w:szCs w:val="28"/>
           <w:lang w:eastAsia="es-PE"/>
         </w:rPr>
+        <w:t> Tarea Académica 1</w:t>
+      </w:r>
+    </w:p>
+    <w:p>
+      <w:pPr>
+        <w:spacing w:before="240" w:after="240" w:line="240" w:lineRule="auto"/>
+        <w:jc w:val="center"/>
+        <w:rPr>
+          <w:rFonts w:ascii="Times New Roman" w:eastAsia="Times New Roman" w:hAnsi="Times New Roman" w:cs="Times New Roman"/>
+          <w:sz w:val="24"/>
+          <w:szCs w:val="24"/>
+          <w:lang w:eastAsia="es-PE"/>
+        </w:rPr>
+      </w:pPr>
+    </w:p>
+    <w:p>
+      <w:pPr>
+        <w:spacing w:before="240" w:after="0" w:line="240" w:lineRule="auto"/>
+        <w:jc w:val="center"/>
+        <w:rPr>
+          <w:rFonts w:ascii="Times New Roman" w:eastAsia="Times New Roman" w:hAnsi="Times New Roman" w:cs="Times New Roman"/>
+          <w:sz w:val="24"/>
+          <w:szCs w:val="24"/>
+          <w:lang w:eastAsia="es-PE"/>
+        </w:rPr>
+      </w:pPr>
+      <w:r>
+        <w:rPr>
+          <w:rFonts w:ascii="Times New Roman" w:eastAsia="Times New Roman" w:hAnsi="Times New Roman" w:cs="Times New Roman"/>
+          <w:b/>
+          <w:bCs/>
+          <w:color w:val="000000"/>
+          <w:sz w:val="28"/>
+          <w:szCs w:val="28"/>
+          <w:lang w:eastAsia="es-PE"/>
+        </w:rPr>
+        <w:t>Alumnos</w:t>
+      </w:r>
+    </w:p>
+    <w:p>
+      <w:pPr>
+        <w:spacing w:before="240" w:after="0" w:line="240" w:lineRule="auto"/>
+        <w:jc w:val="center"/>
+        <w:rPr>
+          <w:rFonts w:ascii="Times New Roman" w:eastAsia="Times New Roman" w:hAnsi="Times New Roman" w:cs="Times New Roman"/>
+          <w:sz w:val="24"/>
+          <w:szCs w:val="24"/>
+          <w:lang w:eastAsia="es-PE"/>
+        </w:rPr>
+      </w:pPr>
+      <w:r>
+        <w:rPr>
+          <w:rFonts w:ascii="Times New Roman" w:eastAsia="Times New Roman" w:hAnsi="Times New Roman" w:cs="Times New Roman"/>
+          <w:color w:val="000000"/>
+          <w:sz w:val="28"/>
+          <w:szCs w:val="28"/>
+          <w:lang w:eastAsia="es-PE"/>
+        </w:rPr>
+        <w:t>Huaquisto Zapana Zaid Joseph</w:t>
+      </w:r>
+    </w:p>
+    <w:p>
+      <w:pPr>
+        <w:spacing w:before="240" w:after="0" w:line="240" w:lineRule="auto"/>
+        <w:rPr>
+          <w:rFonts w:ascii="Times New Roman" w:eastAsia="Times New Roman" w:hAnsi="Times New Roman" w:cs="Times New Roman"/>
+          <w:sz w:val="24"/>
+          <w:szCs w:val="24"/>
+          <w:lang w:eastAsia="es-PE"/>
+        </w:rPr>
+      </w:pPr>
+      <w:r>
+        <w:rPr>
+          <w:rFonts w:ascii="Times New Roman" w:eastAsia="Times New Roman" w:hAnsi="Times New Roman" w:cs="Times New Roman"/>
+          <w:b/>
+          <w:bCs/>
+          <w:color w:val="000000"/>
+          <w:sz w:val="28"/>
+          <w:szCs w:val="28"/>
+          <w:lang w:eastAsia="es-PE"/>
+        </w:rPr>
         <w:t> </w:t>
       </w:r>
-      <w:r>
-        <w:rPr>
-          <w:rFonts w:ascii="Times New Roman" w:eastAsia="Times New Roman" w:hAnsi="Times New Roman" w:cs="Times New Roman"/>
-          <w:color w:val="000000"/>
-          <w:sz w:val="28"/>
-          <w:szCs w:val="28"/>
-          <w:lang w:eastAsia="es-PE"/>
-        </w:rPr>
-        <w:t>Tarea Académica 1</w:t>
-      </w:r>
+    </w:p>
+    <w:p>
+      <w:pPr>
+        <w:spacing w:before="240" w:after="0" w:line="240" w:lineRule="auto"/>
+        <w:jc w:val="center"/>
+        <w:rPr>
+          <w:rFonts w:ascii="Times New Roman" w:eastAsia="Times New Roman" w:hAnsi="Times New Roman" w:cs="Times New Roman"/>
+          <w:sz w:val="24"/>
+          <w:szCs w:val="24"/>
+          <w:lang w:eastAsia="es-PE"/>
+        </w:rPr>
+      </w:pPr>
+      <w:r>
+        <w:rPr>
+          <w:rFonts w:ascii="Times New Roman" w:eastAsia="Times New Roman" w:hAnsi="Times New Roman" w:cs="Times New Roman"/>
+          <w:b/>
+          <w:bCs/>
+          <w:color w:val="000000"/>
+          <w:sz w:val="28"/>
+          <w:szCs w:val="28"/>
+          <w:lang w:eastAsia="es-PE"/>
+        </w:rPr>
+        <w:t>Docente</w:t>
+      </w:r>
+    </w:p>
+    <w:p>
+      <w:pPr>
+        <w:spacing w:before="240" w:after="0" w:line="240" w:lineRule="auto"/>
+        <w:jc w:val="center"/>
+        <w:rPr>
+          <w:rFonts w:ascii="Times New Roman" w:eastAsia="Times New Roman" w:hAnsi="Times New Roman" w:cs="Times New Roman"/>
+          <w:color w:val="000000"/>
+          <w:sz w:val="28"/>
+          <w:szCs w:val="28"/>
+          <w:lang w:eastAsia="es-PE"/>
+        </w:rPr>
+      </w:pPr>
+      <w:r>
+        <w:rPr>
+          <w:rFonts w:ascii="Times New Roman" w:eastAsia="Times New Roman" w:hAnsi="Times New Roman" w:cs="Times New Roman"/>
+          <w:color w:val="000000"/>
+          <w:sz w:val="28"/>
+          <w:szCs w:val="28"/>
+          <w:lang w:eastAsia="es-PE"/>
+        </w:rPr>
+        <w:t>Marizela Yovanna Del Rocio Ventura Valcarcel</w:t>
+      </w:r>
+    </w:p>
+    <w:p>
+      <w:pPr>
+        <w:spacing w:before="240" w:after="0" w:line="240" w:lineRule="auto"/>
+        <w:jc w:val="center"/>
+        <w:rPr>
+          <w:rFonts w:ascii="Times New Roman" w:eastAsia="Times New Roman" w:hAnsi="Times New Roman" w:cs="Times New Roman"/>
+          <w:sz w:val="24"/>
+          <w:szCs w:val="24"/>
+          <w:lang w:eastAsia="es-PE"/>
+        </w:rPr>
+      </w:pPr>
+    </w:p>
+    <w:p>
+      <w:pPr>
+        <w:spacing w:after="0" w:line="240" w:lineRule="auto"/>
+        <w:rPr>
+          <w:rFonts w:ascii="Times New Roman" w:eastAsia="Times New Roman" w:hAnsi="Times New Roman" w:cs="Times New Roman"/>
+          <w:sz w:val="24"/>
+          <w:szCs w:val="24"/>
+          <w:lang w:eastAsia="es-PE"/>
+        </w:rPr>
+      </w:pPr>
     </w:p>
     <w:p>
       <w:pPr>
@@ -292,237 +433,6 @@
           <w:lang w:eastAsia="es-PE"/>
         </w:rPr>
       </w:pPr>
-    </w:p>
-    <w:p>
-      <w:pPr>
-        <w:spacing w:before="240" w:after="0" w:line="240" w:lineRule="auto"/>
-        <w:jc w:val="center"/>
-        <w:rPr>
-          <w:rFonts w:ascii="Times New Roman" w:eastAsia="Times New Roman" w:hAnsi="Times New Roman" w:cs="Times New Roman"/>
-          <w:sz w:val="24"/>
-          <w:szCs w:val="24"/>
-          <w:lang w:eastAsia="es-PE"/>
-        </w:rPr>
-      </w:pPr>
-      <w:r>
-        <w:rPr>
-          <w:rFonts w:ascii="Times New Roman" w:eastAsia="Times New Roman" w:hAnsi="Times New Roman" w:cs="Times New Roman"/>
-          <w:b/>
-          <w:bCs/>
-          <w:color w:val="000000"/>
-          <w:sz w:val="28"/>
-          <w:szCs w:val="28"/>
-          <w:lang w:eastAsia="es-PE"/>
-        </w:rPr>
-        <w:t>Alumnos</w:t>
-      </w:r>
-    </w:p>
-    <w:p>
-      <w:pPr>
-        <w:spacing w:before="240" w:after="0" w:line="240" w:lineRule="auto"/>
-        <w:jc w:val="center"/>
-        <w:rPr>
-          <w:rFonts w:ascii="Times New Roman" w:eastAsia="Times New Roman" w:hAnsi="Times New Roman" w:cs="Times New Roman"/>
-          <w:sz w:val="24"/>
-          <w:szCs w:val="24"/>
-          <w:lang w:eastAsia="es-PE"/>
-        </w:rPr>
-      </w:pPr>
-      <w:proofErr w:type="spellStart"/>
-      <w:r>
-        <w:rPr>
-          <w:rFonts w:ascii="Times New Roman" w:eastAsia="Times New Roman" w:hAnsi="Times New Roman" w:cs="Times New Roman"/>
-          <w:color w:val="000000"/>
-          <w:sz w:val="28"/>
-          <w:szCs w:val="28"/>
-          <w:lang w:eastAsia="es-PE"/>
-        </w:rPr>
-        <w:t>Huaquisto</w:t>
-      </w:r>
-      <w:proofErr w:type="spellEnd"/>
-      <w:r>
-        <w:rPr>
-          <w:rFonts w:ascii="Times New Roman" w:eastAsia="Times New Roman" w:hAnsi="Times New Roman" w:cs="Times New Roman"/>
-          <w:color w:val="000000"/>
-          <w:sz w:val="28"/>
-          <w:szCs w:val="28"/>
-          <w:lang w:eastAsia="es-PE"/>
-        </w:rPr>
-        <w:t xml:space="preserve"> Zapana Zaid Joseph</w:t>
-      </w:r>
-    </w:p>
-    <w:p>
-      <w:pPr>
-        <w:spacing w:before="240" w:after="0" w:line="240" w:lineRule="auto"/>
-        <w:rPr>
-          <w:rFonts w:ascii="Times New Roman" w:eastAsia="Times New Roman" w:hAnsi="Times New Roman" w:cs="Times New Roman"/>
-          <w:sz w:val="24"/>
-          <w:szCs w:val="24"/>
-          <w:lang w:eastAsia="es-PE"/>
-        </w:rPr>
-      </w:pPr>
-      <w:r>
-        <w:rPr>
-          <w:rFonts w:ascii="Times New Roman" w:eastAsia="Times New Roman" w:hAnsi="Times New Roman" w:cs="Times New Roman"/>
-          <w:b/>
-          <w:bCs/>
-          <w:color w:val="000000"/>
-          <w:sz w:val="28"/>
-          <w:szCs w:val="28"/>
-          <w:lang w:eastAsia="es-PE"/>
-        </w:rPr>
-        <w:t> </w:t>
-      </w:r>
-    </w:p>
-    <w:p>
-      <w:pPr>
-        <w:spacing w:before="240" w:after="0" w:line="240" w:lineRule="auto"/>
-        <w:jc w:val="center"/>
-        <w:rPr>
-          <w:rFonts w:ascii="Times New Roman" w:eastAsia="Times New Roman" w:hAnsi="Times New Roman" w:cs="Times New Roman"/>
-          <w:sz w:val="24"/>
-          <w:szCs w:val="24"/>
-          <w:lang w:eastAsia="es-PE"/>
-        </w:rPr>
-      </w:pPr>
-      <w:r>
-        <w:rPr>
-          <w:rFonts w:ascii="Times New Roman" w:eastAsia="Times New Roman" w:hAnsi="Times New Roman" w:cs="Times New Roman"/>
-          <w:b/>
-          <w:bCs/>
-          <w:color w:val="000000"/>
-          <w:sz w:val="28"/>
-          <w:szCs w:val="28"/>
-          <w:lang w:eastAsia="es-PE"/>
-        </w:rPr>
-        <w:t>Docente</w:t>
-      </w:r>
-    </w:p>
-    <w:p>
-      <w:pPr>
-        <w:spacing w:before="240" w:after="0" w:line="240" w:lineRule="auto"/>
-        <w:jc w:val="center"/>
-        <w:rPr>
-          <w:rFonts w:ascii="Times New Roman" w:eastAsia="Times New Roman" w:hAnsi="Times New Roman" w:cs="Times New Roman"/>
-          <w:color w:val="000000"/>
-          <w:sz w:val="28"/>
-          <w:szCs w:val="28"/>
-          <w:lang w:eastAsia="es-PE"/>
-        </w:rPr>
-      </w:pPr>
-      <w:proofErr w:type="spellStart"/>
-      <w:r>
-        <w:rPr>
-          <w:rFonts w:ascii="Times New Roman" w:eastAsia="Times New Roman" w:hAnsi="Times New Roman" w:cs="Times New Roman"/>
-          <w:color w:val="000000"/>
-          <w:sz w:val="28"/>
-          <w:szCs w:val="28"/>
-          <w:lang w:eastAsia="es-PE"/>
-        </w:rPr>
-        <w:t>Marizela</w:t>
-      </w:r>
-      <w:proofErr w:type="spellEnd"/>
-      <w:r>
-        <w:rPr>
-          <w:rFonts w:ascii="Times New Roman" w:eastAsia="Times New Roman" w:hAnsi="Times New Roman" w:cs="Times New Roman"/>
-          <w:color w:val="000000"/>
-          <w:sz w:val="28"/>
-          <w:szCs w:val="28"/>
-          <w:lang w:eastAsia="es-PE"/>
-        </w:rPr>
-        <w:t xml:space="preserve"> </w:t>
-      </w:r>
-      <w:proofErr w:type="spellStart"/>
-      <w:r>
-        <w:rPr>
-          <w:rFonts w:ascii="Times New Roman" w:eastAsia="Times New Roman" w:hAnsi="Times New Roman" w:cs="Times New Roman"/>
-          <w:color w:val="000000"/>
-          <w:sz w:val="28"/>
-          <w:szCs w:val="28"/>
-          <w:lang w:eastAsia="es-PE"/>
-        </w:rPr>
-        <w:t>Yovanna</w:t>
-      </w:r>
-      <w:proofErr w:type="spellEnd"/>
-      <w:r>
-        <w:rPr>
-          <w:rFonts w:ascii="Times New Roman" w:eastAsia="Times New Roman" w:hAnsi="Times New Roman" w:cs="Times New Roman"/>
-          <w:color w:val="000000"/>
-          <w:sz w:val="28"/>
-          <w:szCs w:val="28"/>
-          <w:lang w:eastAsia="es-PE"/>
-        </w:rPr>
-        <w:t xml:space="preserve"> Del </w:t>
-      </w:r>
-      <w:proofErr w:type="spellStart"/>
-      <w:r>
-        <w:rPr>
-          <w:rFonts w:ascii="Times New Roman" w:eastAsia="Times New Roman" w:hAnsi="Times New Roman" w:cs="Times New Roman"/>
-          <w:color w:val="000000"/>
-          <w:sz w:val="28"/>
-          <w:szCs w:val="28"/>
-          <w:lang w:eastAsia="es-PE"/>
-        </w:rPr>
-        <w:t>Rocio</w:t>
-      </w:r>
-      <w:proofErr w:type="spellEnd"/>
-      <w:r>
-        <w:rPr>
-          <w:rFonts w:ascii="Times New Roman" w:eastAsia="Times New Roman" w:hAnsi="Times New Roman" w:cs="Times New Roman"/>
-          <w:color w:val="000000"/>
-          <w:sz w:val="28"/>
-          <w:szCs w:val="28"/>
-          <w:lang w:eastAsia="es-PE"/>
-        </w:rPr>
-        <w:t xml:space="preserve"> Ventura </w:t>
-      </w:r>
-      <w:proofErr w:type="spellStart"/>
-      <w:r>
-        <w:rPr>
-          <w:rFonts w:ascii="Times New Roman" w:eastAsia="Times New Roman" w:hAnsi="Times New Roman" w:cs="Times New Roman"/>
-          <w:color w:val="000000"/>
-          <w:sz w:val="28"/>
-          <w:szCs w:val="28"/>
-          <w:lang w:eastAsia="es-PE"/>
-        </w:rPr>
-        <w:t>Valcarcel</w:t>
-      </w:r>
-      <w:proofErr w:type="spellEnd"/>
-    </w:p>
-    <w:p>
-      <w:pPr>
-        <w:spacing w:before="240" w:after="0" w:line="240" w:lineRule="auto"/>
-        <w:jc w:val="center"/>
-        <w:rPr>
-          <w:rFonts w:ascii="Times New Roman" w:eastAsia="Times New Roman" w:hAnsi="Times New Roman" w:cs="Times New Roman"/>
-          <w:sz w:val="24"/>
-          <w:szCs w:val="24"/>
-          <w:lang w:eastAsia="es-PE"/>
-        </w:rPr>
-      </w:pPr>
-    </w:p>
-    <w:p>
-      <w:pPr>
-        <w:spacing w:after="0" w:line="240" w:lineRule="auto"/>
-        <w:rPr>
-          <w:rFonts w:ascii="Times New Roman" w:eastAsia="Times New Roman" w:hAnsi="Times New Roman" w:cs="Times New Roman"/>
-          <w:sz w:val="24"/>
-          <w:szCs w:val="24"/>
-          <w:lang w:eastAsia="es-PE"/>
-        </w:rPr>
-      </w:pPr>
-    </w:p>
-    <w:p>
-      <w:pPr>
-        <w:spacing w:before="240" w:after="240" w:line="240" w:lineRule="auto"/>
-        <w:jc w:val="center"/>
-        <w:rPr>
-          <w:rFonts w:ascii="Times New Roman" w:eastAsia="Times New Roman" w:hAnsi="Times New Roman" w:cs="Times New Roman"/>
-          <w:sz w:val="24"/>
-          <w:szCs w:val="24"/>
-          <w:lang w:eastAsia="es-PE"/>
-        </w:rPr>
-      </w:pPr>
       <w:r>
         <w:rPr>
           <w:rFonts w:ascii="Times New Roman" w:eastAsia="Times New Roman" w:hAnsi="Times New Roman" w:cs="Times New Roman"/>
@@ -545,7 +455,7 @@
           <w:szCs w:val="28"/>
           <w:lang w:eastAsia="es-PE"/>
         </w:rPr>
-        <w:t>25</w:t>
+        <w:t>13</w:t>
       </w:r>
       <w:r>
         <w:rPr>

</xml_diff>

<commit_message>
Probando esto de las ramas
</commit_message>
<xml_diff>
--- a/CARATULA.docx
+++ b/CARATULA.docx
@@ -1,6 +1,6 @@
 
 <file path=word/document.xml><?xml version="1.0" encoding="utf-8"?>
-<w:document xmlns:wpc="http://schemas.microsoft.com/office/word/2010/wordprocessingCanvas" xmlns:cx="http://schemas.microsoft.com/office/drawing/2014/chartex" xmlns:cx1="http://schemas.microsoft.com/office/drawing/2015/9/8/chartex" xmlns:cx2="http://schemas.microsoft.com/office/drawing/2015/10/21/chartex" xmlns:cx3="http://schemas.microsoft.com/office/drawing/2016/5/9/chartex" xmlns:cx4="http://schemas.microsoft.com/office/drawing/2016/5/10/chartex" xmlns:cx5="http://schemas.microsoft.com/office/drawing/2016/5/11/chartex" xmlns:cx6="http://schemas.microsoft.com/office/drawing/2016/5/12/chartex" xmlns:cx7="http://schemas.microsoft.com/office/drawing/2016/5/13/chartex" xmlns:cx8="http://schemas.microsoft.com/office/drawing/2016/5/14/chartex" xmlns:mc="http://schemas.openxmlformats.org/markup-compatibility/2006" xmlns:aink="http://schemas.microsoft.com/office/drawing/2016/ink" xmlns:am3d="http://schemas.microsoft.com/office/drawing/2017/model3d" xmlns:o="urn:schemas-microsoft-com:office:office" xmlns:oel="http://schemas.microsoft.com/office/2019/extlst" xmlns:r="http://schemas.openxmlformats.org/officeDocument/2006/relationships" xmlns:m="http://schemas.openxmlformats.org/officeDocument/2006/math" xmlns:v="urn:schemas-microsoft-com:vml" xmlns:wp14="http://schemas.microsoft.com/office/word/2010/wordprocessingDrawing" xmlns:wp="http://schemas.openxmlformats.org/drawingml/2006/wordprocessingDrawing" xmlns:w10="urn:schemas-microsoft-com:office:word" xmlns:w="http://schemas.openxmlformats.org/wordprocessingml/2006/main" xmlns:w14="http://schemas.microsoft.com/office/word/2010/wordml" xmlns:w15="http://schemas.microsoft.com/office/word/2012/wordml" xmlns:w16cex="http://schemas.microsoft.com/office/word/2018/wordml/cex" xmlns:w16cid="http://schemas.microsoft.com/office/word/2016/wordml/cid" xmlns:w16="http://schemas.microsoft.com/office/word/2018/wordml" xmlns:w16sdtdh="http://schemas.microsoft.com/office/word/2020/wordml/sdtdatahash" xmlns:w16se="http://schemas.microsoft.com/office/word/2015/wordml/symex" xmlns:wpg="http://schemas.microsoft.com/office/word/2010/wordprocessingGroup" xmlns:wpi="http://schemas.microsoft.com/office/word/2010/wordprocessingInk" xmlns:wne="http://schemas.microsoft.com/office/word/2006/wordml" xmlns:wps="http://schemas.microsoft.com/office/word/2010/wordprocessingShape" mc:Ignorable="w14 w15 w16se w16cid w16 w16cex w16sdtdh wp14">
+<w:document xmlns:wpc="http://schemas.microsoft.com/office/word/2010/wordprocessingCanvas" xmlns:cx="http://schemas.microsoft.com/office/drawing/2014/chartex" xmlns:cx1="http://schemas.microsoft.com/office/drawing/2015/9/8/chartex" xmlns:cx2="http://schemas.microsoft.com/office/drawing/2015/10/21/chartex" xmlns:cx3="http://schemas.microsoft.com/office/drawing/2016/5/9/chartex" xmlns:cx4="http://schemas.microsoft.com/office/drawing/2016/5/10/chartex" xmlns:cx5="http://schemas.microsoft.com/office/drawing/2016/5/11/chartex" xmlns:cx6="http://schemas.microsoft.com/office/drawing/2016/5/12/chartex" xmlns:cx7="http://schemas.microsoft.com/office/drawing/2016/5/13/chartex" xmlns:cx8="http://schemas.microsoft.com/office/drawing/2016/5/14/chartex" xmlns:mc="http://schemas.openxmlformats.org/markup-compatibility/2006" xmlns:aink="http://schemas.microsoft.com/office/drawing/2016/ink" xmlns:am3d="http://schemas.microsoft.com/office/drawing/2017/model3d" xmlns:o="urn:schemas-microsoft-com:office:office" xmlns:r="http://schemas.openxmlformats.org/officeDocument/2006/relationships" xmlns:m="http://schemas.openxmlformats.org/officeDocument/2006/math" xmlns:v="urn:schemas-microsoft-com:vml" xmlns:wp14="http://schemas.microsoft.com/office/word/2010/wordprocessingDrawing" xmlns:wp="http://schemas.openxmlformats.org/drawingml/2006/wordprocessingDrawing" xmlns:w10="urn:schemas-microsoft-com:office:word" xmlns:w="http://schemas.openxmlformats.org/wordprocessingml/2006/main" xmlns:w14="http://schemas.microsoft.com/office/word/2010/wordml" xmlns:w15="http://schemas.microsoft.com/office/word/2012/wordml" xmlns:w16cex="http://schemas.microsoft.com/office/word/2018/wordml/cex" xmlns:w16cid="http://schemas.microsoft.com/office/word/2016/wordml/cid" xmlns:w16="http://schemas.microsoft.com/office/word/2018/wordml" xmlns:w16sdtdh="http://schemas.microsoft.com/office/word/2020/wordml/sdtdatahash" xmlns:w16se="http://schemas.microsoft.com/office/word/2015/wordml/symex" xmlns:wpg="http://schemas.microsoft.com/office/word/2010/wordprocessingGroup" xmlns:wpi="http://schemas.microsoft.com/office/word/2010/wordprocessingInk" xmlns:wne="http://schemas.microsoft.com/office/word/2006/wordml" xmlns:wps="http://schemas.microsoft.com/office/word/2010/wordprocessingShape" mc:Ignorable="w14 w15 w16se w16cid w16 w16cex w16sdtdh wp14">
   <w:body>
     <w:p>
       <w:pPr>
@@ -268,7 +268,7 @@
           <w:szCs w:val="28"/>
           <w:lang w:eastAsia="es-PE"/>
         </w:rPr>
-        <w:t> Tarea Académica 1</w:t>
+        <w:t>Cambio, solo esta en la Rama B</w:t>
       </w:r>
     </w:p>
     <w:p>

</xml_diff>